<commit_message>
fix: resources change layout
</commit_message>
<xml_diff>
--- a/frontend/public/Proposal_Hackathon_2026_Apr_07.docx
+++ b/frontend/public/Proposal_Hackathon_2026_Apr_07.docx
@@ -602,8 +602,11 @@
         <w:jc w:val="thaiDistribute"/>
       </w:pPr>
       <w:r>
-        <w:pict w14:anchorId="18CEF60F">
-          <v:rect id="_x0000_i1045" style="width:0;height:1.5pt" o:hralign="center" o:hrstd="t" o:hr="t" fillcolor="#a0a0a0" stroked="f"/>
+        <w:rPr>
+          <w:noProof/>
+        </w:rPr>
+        <w:pict w14:anchorId="081A8846">
+          <v:rect id="_x0000_i1028" alt="" style="width:468pt;height:.05pt;mso-width-percent:0;mso-height-percent:0;mso-width-percent:0;mso-height-percent:0" o:hralign="center" o:hrstd="t" o:hr="t" fillcolor="#a0a0a0" stroked="f"/>
         </w:pict>
       </w:r>
     </w:p>
@@ -891,8 +894,11 @@
         <w:jc w:val="thaiDistribute"/>
       </w:pPr>
       <w:r>
-        <w:pict w14:anchorId="56C25D36">
-          <v:rect id="_x0000_i1046" style="width:0;height:1.5pt" o:hralign="center" o:hrstd="t" o:hr="t" fillcolor="#a0a0a0" stroked="f"/>
+        <w:rPr>
+          <w:noProof/>
+        </w:rPr>
+        <w:pict w14:anchorId="65F7CF21">
+          <v:rect id="_x0000_i1027" alt="" style="width:468pt;height:.05pt;mso-width-percent:0;mso-height-percent:0;mso-width-percent:0;mso-height-percent:0" o:hralign="center" o:hrstd="t" o:hr="t" fillcolor="#a0a0a0" stroked="f"/>
         </w:pict>
       </w:r>
     </w:p>
@@ -1205,8 +1211,11 @@
         <w:jc w:val="thaiDistribute"/>
       </w:pPr>
       <w:r>
-        <w:pict w14:anchorId="797ED08F">
-          <v:rect id="_x0000_i1047" style="width:0;height:1.5pt" o:hralign="center" o:hrstd="t" o:hr="t" fillcolor="#a0a0a0" stroked="f"/>
+        <w:rPr>
+          <w:noProof/>
+        </w:rPr>
+        <w:pict w14:anchorId="1FDD9886">
+          <v:rect id="_x0000_i1026" alt="" style="width:468pt;height:.05pt;mso-width-percent:0;mso-height-percent:0;mso-width-percent:0;mso-height-percent:0" o:hralign="center" o:hrstd="t" o:hr="t" fillcolor="#a0a0a0" stroked="f"/>
         </w:pict>
       </w:r>
     </w:p>
@@ -1295,57 +1304,15 @@
         </w:rPr>
         <w:t xml:space="preserve"> </w:t>
       </w:r>
-      <w:proofErr w:type="gramStart"/>
-      <w:r>
-        <w:t>[ Input</w:t>
-      </w:r>
-      <w:proofErr w:type="gramEnd"/>
-      <w:r>
-        <w:t xml:space="preserve"> Data </w:t>
+      <w:r>
+        <w:t xml:space="preserve">[ Input Data </w:t>
       </w:r>
       <w:r>
         <w:t>1</w:t>
       </w:r>
       <w:r>
-        <w:t xml:space="preserve">] --&gt; </w:t>
-      </w:r>
-      <w:proofErr w:type="gramStart"/>
-      <w:r>
-        <w:t>[ Data</w:t>
-      </w:r>
-      <w:proofErr w:type="gramEnd"/>
-      <w:r>
-        <w:t xml:space="preserve"> Pre-</w:t>
-      </w:r>
-      <w:proofErr w:type="gramStart"/>
-      <w:r>
-        <w:t>processing ]</w:t>
-      </w:r>
-      <w:proofErr w:type="gramEnd"/>
-      <w:r>
-        <w:t xml:space="preserve"> --&gt; </w:t>
-      </w:r>
-      <w:proofErr w:type="gramStart"/>
-      <w:r>
-        <w:t>[ Analysis</w:t>
-      </w:r>
-      <w:proofErr w:type="gramEnd"/>
-      <w:r>
-        <w:t>/</w:t>
-      </w:r>
-      <w:proofErr w:type="gramStart"/>
-      <w:r>
-        <w:t>Model ]</w:t>
-      </w:r>
-      <w:proofErr w:type="gramEnd"/>
-      <w:r>
-        <w:t xml:space="preserve"> --&gt; [ </w:t>
-      </w:r>
-      <w:proofErr w:type="gramStart"/>
-      <w:r>
-        <w:t>Result ]</w:t>
-      </w:r>
-      <w:proofErr w:type="gramEnd"/>
+        <w:t>] --&gt; [ Data Pre-processing ] --&gt; [ Analysis/Model ] --&gt; [ Result ]</w:t>
+      </w:r>
     </w:p>
     <w:p>
       <w:pPr>
@@ -1411,29 +1378,13 @@
         <w:t>x</w:t>
       </w:r>
       <w:r>
-        <w:t xml:space="preserve"> Layer2) + ... + (</w:t>
-      </w:r>
-      <w:proofErr w:type="spellStart"/>
-      <w:r>
-        <w:t>wn</w:t>
-      </w:r>
-      <w:proofErr w:type="spellEnd"/>
-      <w:r>
-        <w:t xml:space="preserve"> </w:t>
+        <w:t xml:space="preserve"> Layer2) + ... + (wn </w:t>
       </w:r>
       <w:r>
         <w:t>x</w:t>
       </w:r>
       <w:r>
-        <w:t xml:space="preserve"> </w:t>
-      </w:r>
-      <w:proofErr w:type="spellStart"/>
-      <w:r>
-        <w:t>Layern</w:t>
-      </w:r>
-      <w:proofErr w:type="spellEnd"/>
-      <w:r>
-        <w:t>)</w:t>
+        <w:t xml:space="preserve"> Layern)</w:t>
       </w:r>
       <w:r>
         <w:t xml:space="preserve"> </w:t>
@@ -1593,8 +1544,11 @@
         <w:jc w:val="thaiDistribute"/>
       </w:pPr>
       <w:r>
-        <w:pict w14:anchorId="1113E607">
-          <v:rect id="_x0000_i1048" style="width:0;height:1.5pt" o:hralign="center" o:hrstd="t" o:hr="t" fillcolor="#a0a0a0" stroked="f"/>
+        <w:rPr>
+          <w:noProof/>
+        </w:rPr>
+        <w:pict w14:anchorId="35D66E8D">
+          <v:rect id="_x0000_i1025" alt="" style="width:468pt;height:.05pt;mso-width-percent:0;mso-height-percent:0;mso-width-percent:0;mso-height-percent:0" o:hralign="center" o:hrstd="t" o:hr="t" fillcolor="#a0a0a0" stroked="f"/>
         </w:pict>
       </w:r>
     </w:p>
@@ -1885,16 +1839,8 @@
                               </w:rPr>
                               <w:t xml:space="preserve"> หน้า </w:t>
                             </w:r>
-                            <w:proofErr w:type="spellStart"/>
                             <w:r>
-                              <w:t>Angsana</w:t>
-                            </w:r>
-                            <w:proofErr w:type="spellEnd"/>
-                            <w:r>
-                              <w:t xml:space="preserve"> New</w:t>
-                            </w:r>
-                            <w:r>
-                              <w:t xml:space="preserve"> </w:t>
+                              <w:t xml:space="preserve">Angsana New </w:t>
                             </w:r>
                             <w:r>
                               <w:rPr>
@@ -2080,7 +2026,7 @@
                             <w:pPr>
                               <w:jc w:val="center"/>
                               <w:rPr>
-                                <w:rFonts w:ascii="TH SarabunPSK" w:hAnsi="TH SarabunPSK" w:cs="TH SarabunPSK" w:hint="cs"/>
+                                <w:rFonts w:ascii="TH SarabunPSK" w:hAnsi="TH SarabunPSK" w:cs="TH SarabunPSK"/>
                                 <w:b/>
                                 <w:bCs/>
                                 <w:color w:val="EE0000"/>
@@ -2107,13 +2053,12 @@
                             </w:r>
                             <w:r>
                               <w:rPr>
-                                <w:rFonts w:ascii="TH SarabunPSK" w:hAnsi="TH SarabunPSK" w:cs="TH SarabunPSK" w:hint="cs"/>
+                                <w:rFonts w:ascii="TH SarabunPSK" w:hAnsi="TH SarabunPSK" w:cs="TH SarabunPSK"/>
                                 <w:b/>
                                 <w:bCs/>
                                 <w:color w:val="FF0000"/>
-                                <w:cs/>
                               </w:rPr>
-                              <w:t>28</w:t>
+                              <w:t>27</w:t>
                             </w:r>
                             <w:r>
                               <w:rPr>
@@ -2319,14 +2264,18 @@
           </mc:Choice>
           <mc:Fallback>
             <w:pict>
-              <v:shape w14:anchorId="0BE5C58A" id="Text Box 4" o:spid="_x0000_s1027" type="#_x0000_t202" style="position:absolute;margin-left:38.8pt;margin-top:16.3pt;width:404.25pt;height:51.75pt;z-index:251661312;visibility:visible;mso-wrap-style:square;mso-width-percent:0;mso-height-percent:0;mso-wrap-distance-left:9pt;mso-wrap-distance-top:0;mso-wrap-distance-right:9pt;mso-wrap-distance-bottom:0;mso-position-horizontal:absolute;mso-position-horizontal-relative:margin;mso-position-vertical:absolute;mso-position-vertical-relative:text;mso-width-percent:0;mso-height-percent:0;mso-width-relative:margin;mso-height-relative:margin;v-text-anchor:top" o:gfxdata="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" fillcolor="window" strokeweight=".5pt">
+              <v:shapetype w14:anchorId="0BE5C58A" id="_x0000_t202" coordsize="21600,21600" o:spt="202" path="m,l,21600r21600,l21600,xe">
+                <v:stroke joinstyle="miter"/>
+                <v:path gradientshapeok="t" o:connecttype="rect"/>
+              </v:shapetype>
+              <v:shape id="Text Box 4" o:spid="_x0000_s1027" type="#_x0000_t202" style="position:absolute;margin-left:38.8pt;margin-top:16.3pt;width:404.25pt;height:51.75pt;z-index:251661312;visibility:visible;mso-wrap-style:square;mso-width-percent:0;mso-height-percent:0;mso-wrap-distance-left:9pt;mso-wrap-distance-top:0;mso-wrap-distance-right:9pt;mso-wrap-distance-bottom:0;mso-position-horizontal:absolute;mso-position-horizontal-relative:margin;mso-position-vertical:absolute;mso-position-vertical-relative:text;mso-width-percent:0;mso-height-percent:0;mso-width-relative:margin;mso-height-relative:margin;v-text-anchor:top" o:gfxdata="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" fillcolor="window" strokeweight=".5pt">
                 <v:textbox>
                   <w:txbxContent>
                     <w:p>
                       <w:pPr>
                         <w:jc w:val="center"/>
                         <w:rPr>
-                          <w:rFonts w:ascii="TH SarabunPSK" w:hAnsi="TH SarabunPSK" w:cs="TH SarabunPSK" w:hint="cs"/>
+                          <w:rFonts w:ascii="TH SarabunPSK" w:hAnsi="TH SarabunPSK" w:cs="TH SarabunPSK"/>
                           <w:b/>
                           <w:bCs/>
                           <w:color w:val="EE0000"/>
@@ -2353,13 +2302,12 @@
                       </w:r>
                       <w:r>
                         <w:rPr>
-                          <w:rFonts w:ascii="TH SarabunPSK" w:hAnsi="TH SarabunPSK" w:cs="TH SarabunPSK" w:hint="cs"/>
+                          <w:rFonts w:ascii="TH SarabunPSK" w:hAnsi="TH SarabunPSK" w:cs="TH SarabunPSK"/>
                           <w:b/>
                           <w:bCs/>
                           <w:color w:val="FF0000"/>
-                          <w:cs/>
                         </w:rPr>
-                        <w:t>28</w:t>
+                        <w:t>27</w:t>
                       </w:r>
                       <w:r>
                         <w:rPr>

</xml_diff>